<commit_message>
docs: perbarui laporan pertemuan 8 dengan cover berlogo tanpa footer
</commit_message>
<xml_diff>
--- a/Pertemuan 8 - Klasifikasi/Klasifikasi_434241079.docx
+++ b/Pertemuan 8 - Klasifikasi/Klasifikasi_434241079.docx
@@ -2,9 +2,6 @@
 <file path=word/document.xml><?xml version="1.0" encoding="utf-8"?>
 <w:document xmlns:wpc="http://schemas.microsoft.com/office/word/2010/wordprocessingCanvas" xmlns:mo="http://schemas.microsoft.com/office/mac/office/2008/main" xmlns:mc="http://schemas.openxmlformats.org/markup-compatibility/2006" xmlns:mv="urn:schemas-microsoft-com:mac:vml" xmlns:o="urn:schemas-microsoft-com:office:office" xmlns:r="http://schemas.openxmlformats.org/officeDocument/2006/relationships" xmlns:m="http://schemas.openxmlformats.org/officeDocument/2006/math" xmlns:v="urn:schemas-microsoft-com:vml" xmlns:wp14="http://schemas.microsoft.com/office/word/2010/wordprocessingDrawing" xmlns:wp="http://schemas.openxmlformats.org/drawingml/2006/wordprocessingDrawing" xmlns:w10="urn:schemas-microsoft-com:office:word" xmlns:w="http://schemas.openxmlformats.org/wordprocessingml/2006/main" xmlns:w14="http://schemas.microsoft.com/office/word/2010/wordml" xmlns:wpg="http://schemas.microsoft.com/office/word/2010/wordprocessingGroup" xmlns:wpi="http://schemas.microsoft.com/office/word/2010/wordprocessingInk" xmlns:wne="http://schemas.microsoft.com/office/word/2006/wordml" xmlns:wps="http://schemas.microsoft.com/office/word/2010/wordprocessingShape" mc:Ignorable="w14 wp14">
   <w:body>
-    <w:p/>
-    <w:p/>
-    <w:p/>
     <w:p/>
     <w:p/>
     <w:p/>
@@ -48,7 +45,45 @@
       </w:r>
     </w:p>
     <w:p/>
-    <w:p/>
+    <w:p>
+      <w:pPr>
+        <w:jc w:val="center"/>
+      </w:pPr>
+      <w:r>
+        <w:drawing>
+          <wp:inline xmlns:a="http://schemas.openxmlformats.org/drawingml/2006/main" xmlns:pic="http://schemas.openxmlformats.org/drawingml/2006/picture">
+            <wp:extent cx="1620000" cy="1620000"/>
+            <wp:docPr id="1" name="Picture 1"/>
+            <wp:cNvGraphicFramePr>
+              <a:graphicFrameLocks noChangeAspect="1"/>
+            </wp:cNvGraphicFramePr>
+            <a:graphic>
+              <a:graphicData uri="http://schemas.openxmlformats.org/drawingml/2006/picture">
+                <pic:pic>
+                  <pic:nvPicPr>
+                    <pic:cNvPr id="0" name="logo_unair.png"/>
+                    <pic:cNvPicPr/>
+                  </pic:nvPicPr>
+                  <pic:blipFill>
+                    <a:blip r:embed="rId9"/>
+                    <a:stretch>
+                      <a:fillRect/>
+                    </a:stretch>
+                  </pic:blipFill>
+                  <pic:spPr>
+                    <a:xfrm>
+                      <a:off x="0" y="0"/>
+                      <a:ext cx="1620000" cy="1620000"/>
+                    </a:xfrm>
+                    <a:prstGeom prst="rect"/>
+                  </pic:spPr>
+                </pic:pic>
+              </a:graphicData>
+            </a:graphic>
+          </wp:inline>
+        </w:drawing>
+      </w:r>
+    </w:p>
     <w:p/>
     <w:p>
       <w:pPr>
@@ -394,7 +429,7 @@
         <w:drawing>
           <wp:inline xmlns:a="http://schemas.openxmlformats.org/drawingml/2006/main" xmlns:pic="http://schemas.openxmlformats.org/drawingml/2006/picture">
             <wp:extent cx="4515729" cy="3277773"/>
-            <wp:docPr id="1" name="Picture 1"/>
+            <wp:docPr id="2" name="Picture 2"/>
             <wp:cNvGraphicFramePr>
               <a:graphicFrameLocks noChangeAspect="1"/>
             </wp:cNvGraphicFramePr>
@@ -406,7 +441,7 @@
                     <pic:cNvPicPr/>
                   </pic:nvPicPr>
                   <pic:blipFill>
-                    <a:blip r:embed="rId9"/>
+                    <a:blip r:embed="rId10"/>
                     <a:stretch>
                       <a:fillRect/>
                     </a:stretch>
@@ -550,7 +585,7 @@
         <w:drawing>
           <wp:inline xmlns:a="http://schemas.openxmlformats.org/drawingml/2006/main" xmlns:pic="http://schemas.openxmlformats.org/drawingml/2006/picture">
             <wp:extent cx="5022166" cy="5416061"/>
-            <wp:docPr id="2" name="Picture 2"/>
+            <wp:docPr id="3" name="Picture 3"/>
             <wp:cNvGraphicFramePr>
               <a:graphicFrameLocks noChangeAspect="1"/>
             </wp:cNvGraphicFramePr>
@@ -562,7 +597,7 @@
                     <pic:cNvPicPr/>
                   </pic:nvPicPr>
                   <pic:blipFill>
-                    <a:blip r:embed="rId10"/>
+                    <a:blip r:embed="rId11"/>
                     <a:stretch>
                       <a:fillRect/>
                     </a:stretch>
@@ -603,7 +638,7 @@
         <w:drawing>
           <wp:inline xmlns:a="http://schemas.openxmlformats.org/drawingml/2006/main" xmlns:pic="http://schemas.openxmlformats.org/drawingml/2006/picture">
             <wp:extent cx="4515729" cy="1927274"/>
-            <wp:docPr id="3" name="Picture 3"/>
+            <wp:docPr id="4" name="Picture 4"/>
             <wp:cNvGraphicFramePr>
               <a:graphicFrameLocks noChangeAspect="1"/>
             </wp:cNvGraphicFramePr>
@@ -615,7 +650,7 @@
                     <pic:cNvPicPr/>
                   </pic:nvPicPr>
                   <pic:blipFill>
-                    <a:blip r:embed="rId11"/>
+                    <a:blip r:embed="rId12"/>
                     <a:stretch>
                       <a:fillRect/>
                     </a:stretch>
@@ -656,7 +691,7 @@
         <w:drawing>
           <wp:inline xmlns:a="http://schemas.openxmlformats.org/drawingml/2006/main" xmlns:pic="http://schemas.openxmlformats.org/drawingml/2006/picture">
             <wp:extent cx="5296486" cy="3945987"/>
-            <wp:docPr id="4" name="Picture 4"/>
+            <wp:docPr id="5" name="Picture 5"/>
             <wp:cNvGraphicFramePr>
               <a:graphicFrameLocks noChangeAspect="1"/>
             </wp:cNvGraphicFramePr>
@@ -668,7 +703,7 @@
                     <pic:cNvPicPr/>
                   </pic:nvPicPr>
                   <pic:blipFill>
-                    <a:blip r:embed="rId12"/>
+                    <a:blip r:embed="rId13"/>
                     <a:stretch>
                       <a:fillRect/>
                     </a:stretch>
@@ -793,7 +828,7 @@
         <w:drawing>
           <wp:inline xmlns:a="http://schemas.openxmlformats.org/drawingml/2006/main" xmlns:pic="http://schemas.openxmlformats.org/drawingml/2006/picture">
             <wp:extent cx="5134707" cy="3615396"/>
-            <wp:docPr id="5" name="Picture 5"/>
+            <wp:docPr id="6" name="Picture 6"/>
             <wp:cNvGraphicFramePr>
               <a:graphicFrameLocks noChangeAspect="1"/>
             </wp:cNvGraphicFramePr>
@@ -805,7 +840,7 @@
                     <pic:cNvPicPr/>
                   </pic:nvPicPr>
                   <pic:blipFill>
-                    <a:blip r:embed="rId13"/>
+                    <a:blip r:embed="rId14"/>
                     <a:stretch>
                       <a:fillRect/>
                     </a:stretch>
@@ -846,7 +881,7 @@
         <w:drawing>
           <wp:inline xmlns:a="http://schemas.openxmlformats.org/drawingml/2006/main" xmlns:pic="http://schemas.openxmlformats.org/drawingml/2006/picture">
             <wp:extent cx="5580000" cy="3397115"/>
-            <wp:docPr id="6" name="Picture 6"/>
+            <wp:docPr id="7" name="Picture 7"/>
             <wp:cNvGraphicFramePr>
               <a:graphicFrameLocks noChangeAspect="1"/>
             </wp:cNvGraphicFramePr>
@@ -858,7 +893,7 @@
                     <pic:cNvPicPr/>
                   </pic:nvPicPr>
                   <pic:blipFill>
-                    <a:blip r:embed="rId14"/>
+                    <a:blip r:embed="rId15"/>
                     <a:stretch>
                       <a:fillRect/>
                     </a:stretch>
@@ -904,7 +939,7 @@
         <w:drawing>
           <wp:inline xmlns:a="http://schemas.openxmlformats.org/drawingml/2006/main" xmlns:pic="http://schemas.openxmlformats.org/drawingml/2006/picture">
             <wp:extent cx="4508695" cy="3312941"/>
-            <wp:docPr id="7" name="Picture 7"/>
+            <wp:docPr id="8" name="Picture 8"/>
             <wp:cNvGraphicFramePr>
               <a:graphicFrameLocks noChangeAspect="1"/>
             </wp:cNvGraphicFramePr>
@@ -916,7 +951,7 @@
                     <pic:cNvPicPr/>
                   </pic:nvPicPr>
                   <pic:blipFill>
-                    <a:blip r:embed="rId15"/>
+                    <a:blip r:embed="rId16"/>
                     <a:stretch>
                       <a:fillRect/>
                     </a:stretch>
@@ -957,7 +992,7 @@
         <w:drawing>
           <wp:inline xmlns:a="http://schemas.openxmlformats.org/drawingml/2006/main" xmlns:pic="http://schemas.openxmlformats.org/drawingml/2006/picture">
             <wp:extent cx="4508695" cy="3312941"/>
-            <wp:docPr id="8" name="Picture 8"/>
+            <wp:docPr id="9" name="Picture 9"/>
             <wp:cNvGraphicFramePr>
               <a:graphicFrameLocks noChangeAspect="1"/>
             </wp:cNvGraphicFramePr>
@@ -969,7 +1004,7 @@
                     <pic:cNvPicPr/>
                   </pic:nvPicPr>
                   <pic:blipFill>
-                    <a:blip r:embed="rId16"/>
+                    <a:blip r:embed="rId17"/>
                     <a:stretch>
                       <a:fillRect/>
                     </a:stretch>
@@ -1030,7 +1065,7 @@
         <w:drawing>
           <wp:inline xmlns:a="http://schemas.openxmlformats.org/drawingml/2006/main" xmlns:pic="http://schemas.openxmlformats.org/drawingml/2006/picture">
             <wp:extent cx="5940000" cy="1721739"/>
-            <wp:docPr id="9" name="Picture 9"/>
+            <wp:docPr id="10" name="Picture 10"/>
             <wp:cNvGraphicFramePr>
               <a:graphicFrameLocks noChangeAspect="1"/>
             </wp:cNvGraphicFramePr>
@@ -1042,7 +1077,7 @@
                     <pic:cNvPicPr/>
                   </pic:nvPicPr>
                   <pic:blipFill>
-                    <a:blip r:embed="rId17"/>
+                    <a:blip r:embed="rId18"/>
                     <a:stretch>
                       <a:fillRect/>
                     </a:stretch>
@@ -1651,7 +1686,7 @@
         <w:drawing>
           <wp:inline xmlns:a="http://schemas.openxmlformats.org/drawingml/2006/main" xmlns:pic="http://schemas.openxmlformats.org/drawingml/2006/picture">
             <wp:extent cx="5940000" cy="1721739"/>
-            <wp:docPr id="10" name="Picture 10"/>
+            <wp:docPr id="11" name="Picture 11"/>
             <wp:cNvGraphicFramePr>
               <a:graphicFrameLocks noChangeAspect="1"/>
             </wp:cNvGraphicFramePr>
@@ -1663,7 +1698,7 @@
                     <pic:cNvPicPr/>
                   </pic:nvPicPr>
                   <pic:blipFill>
-                    <a:blip r:embed="rId18"/>
+                    <a:blip r:embed="rId19"/>
                     <a:stretch>
                       <a:fillRect/>
                     </a:stretch>
@@ -2397,7 +2432,7 @@
         <w:drawing>
           <wp:inline xmlns:a="http://schemas.openxmlformats.org/drawingml/2006/main" xmlns:pic="http://schemas.openxmlformats.org/drawingml/2006/picture">
             <wp:extent cx="5400000" cy="2700000"/>
-            <wp:docPr id="11" name="Picture 11"/>
+            <wp:docPr id="12" name="Picture 12"/>
             <wp:cNvGraphicFramePr>
               <a:graphicFrameLocks noChangeAspect="1"/>
             </wp:cNvGraphicFramePr>
@@ -2409,7 +2444,7 @@
                     <pic:cNvPicPr/>
                   </pic:nvPicPr>
                   <pic:blipFill>
-                    <a:blip r:embed="rId19"/>
+                    <a:blip r:embed="rId20"/>
                     <a:stretch>
                       <a:fillRect/>
                     </a:stretch>
@@ -2517,7 +2552,7 @@
         <w:drawing>
           <wp:inline xmlns:a="http://schemas.openxmlformats.org/drawingml/2006/main" xmlns:pic="http://schemas.openxmlformats.org/drawingml/2006/picture">
             <wp:extent cx="4445390" cy="2152356"/>
-            <wp:docPr id="12" name="Picture 12"/>
+            <wp:docPr id="13" name="Picture 13"/>
             <wp:cNvGraphicFramePr>
               <a:graphicFrameLocks noChangeAspect="1"/>
             </wp:cNvGraphicFramePr>
@@ -2529,7 +2564,7 @@
                     <pic:cNvPicPr/>
                   </pic:nvPicPr>
                   <pic:blipFill>
-                    <a:blip r:embed="rId20"/>
+                    <a:blip r:embed="rId21"/>
                     <a:stretch>
                       <a:fillRect/>
                     </a:stretch>
@@ -2628,7 +2663,7 @@
         <w:drawing>
           <wp:inline xmlns:a="http://schemas.openxmlformats.org/drawingml/2006/main" xmlns:pic="http://schemas.openxmlformats.org/drawingml/2006/picture">
             <wp:extent cx="5190978" cy="5866227"/>
-            <wp:docPr id="13" name="Picture 13"/>
+            <wp:docPr id="14" name="Picture 14"/>
             <wp:cNvGraphicFramePr>
               <a:graphicFrameLocks noChangeAspect="1"/>
             </wp:cNvGraphicFramePr>
@@ -2640,7 +2675,7 @@
                     <pic:cNvPicPr/>
                   </pic:nvPicPr>
                   <pic:blipFill>
-                    <a:blip r:embed="rId21"/>
+                    <a:blip r:embed="rId22"/>
                     <a:stretch>
                       <a:fillRect/>
                     </a:stretch>
@@ -2681,7 +2716,7 @@
         <w:drawing>
           <wp:inline xmlns:a="http://schemas.openxmlformats.org/drawingml/2006/main" xmlns:pic="http://schemas.openxmlformats.org/drawingml/2006/picture">
             <wp:extent cx="5580000" cy="4244139"/>
-            <wp:docPr id="14" name="Picture 14"/>
+            <wp:docPr id="15" name="Picture 15"/>
             <wp:cNvGraphicFramePr>
               <a:graphicFrameLocks noChangeAspect="1"/>
             </wp:cNvGraphicFramePr>
@@ -2693,7 +2728,7 @@
                     <pic:cNvPicPr/>
                   </pic:nvPicPr>
                   <pic:blipFill>
-                    <a:blip r:embed="rId22"/>
+                    <a:blip r:embed="rId23"/>
                     <a:stretch>
                       <a:fillRect/>
                     </a:stretch>
@@ -2734,7 +2769,7 @@
         <w:drawing>
           <wp:inline xmlns:a="http://schemas.openxmlformats.org/drawingml/2006/main" xmlns:pic="http://schemas.openxmlformats.org/drawingml/2006/picture">
             <wp:extent cx="5759999" cy="3987692"/>
-            <wp:docPr id="15" name="Picture 15"/>
+            <wp:docPr id="16" name="Picture 16"/>
             <wp:cNvGraphicFramePr>
               <a:graphicFrameLocks noChangeAspect="1"/>
             </wp:cNvGraphicFramePr>
@@ -2746,7 +2781,7 @@
                     <pic:cNvPicPr/>
                   </pic:nvPicPr>
                   <pic:blipFill>
-                    <a:blip r:embed="rId23"/>
+                    <a:blip r:embed="rId24"/>
                     <a:stretch>
                       <a:fillRect/>
                     </a:stretch>
@@ -2787,7 +2822,7 @@
         <w:drawing>
           <wp:inline xmlns:a="http://schemas.openxmlformats.org/drawingml/2006/main" xmlns:pic="http://schemas.openxmlformats.org/drawingml/2006/picture">
             <wp:extent cx="5759999" cy="4908637"/>
-            <wp:docPr id="16" name="Picture 16"/>
+            <wp:docPr id="17" name="Picture 17"/>
             <wp:cNvGraphicFramePr>
               <a:graphicFrameLocks noChangeAspect="1"/>
             </wp:cNvGraphicFramePr>
@@ -2799,7 +2834,7 @@
                     <pic:cNvPicPr/>
                   </pic:nvPicPr>
                   <pic:blipFill>
-                    <a:blip r:embed="rId24"/>
+                    <a:blip r:embed="rId25"/>
                     <a:stretch>
                       <a:fillRect/>
                     </a:stretch>
@@ -3085,7 +3120,7 @@
         <w:drawing>
           <wp:inline xmlns:a="http://schemas.openxmlformats.org/drawingml/2006/main" xmlns:pic="http://schemas.openxmlformats.org/drawingml/2006/picture">
             <wp:extent cx="5940000" cy="5303571"/>
-            <wp:docPr id="17" name="Picture 17"/>
+            <wp:docPr id="18" name="Picture 18"/>
             <wp:cNvGraphicFramePr>
               <a:graphicFrameLocks noChangeAspect="1"/>
             </wp:cNvGraphicFramePr>
@@ -3097,7 +3132,7 @@
                     <pic:cNvPicPr/>
                   </pic:nvPicPr>
                   <pic:blipFill>
-                    <a:blip r:embed="rId25"/>
+                    <a:blip r:embed="rId26"/>
                     <a:stretch>
                       <a:fillRect/>
                     </a:stretch>
@@ -3138,7 +3173,7 @@
         <w:drawing>
           <wp:inline xmlns:a="http://schemas.openxmlformats.org/drawingml/2006/main" xmlns:pic="http://schemas.openxmlformats.org/drawingml/2006/picture">
             <wp:extent cx="5940000" cy="5303571"/>
-            <wp:docPr id="18" name="Picture 18"/>
+            <wp:docPr id="19" name="Picture 19"/>
             <wp:cNvGraphicFramePr>
               <a:graphicFrameLocks noChangeAspect="1"/>
             </wp:cNvGraphicFramePr>
@@ -3150,7 +3185,7 @@
                     <pic:cNvPicPr/>
                   </pic:nvPicPr>
                   <pic:blipFill>
-                    <a:blip r:embed="rId26"/>
+                    <a:blip r:embed="rId27"/>
                     <a:stretch>
                       <a:fillRect/>
                     </a:stretch>
@@ -3263,7 +3298,6 @@
       </w:r>
     </w:p>
     <w:sectPr>
-      <w:footerReference w:type="default" r:id="rId27"/>
       <w:pgSz w:w="12240" w:h="15840"/>
       <w:pgMar w:top="1296" w:right="1296" w:bottom="1152" w:left="1296" w:header="720" w:footer="720" w:gutter="0"/>
       <w:cols w:space="720"/>
@@ -3271,25 +3305,6 @@
     </w:sectPr>
   </w:body>
 </w:document>
-</file>
-
-<file path=word/footer1.xml><?xml version="1.0" encoding="utf-8"?>
-<w:ftr xmlns:m="http://schemas.openxmlformats.org/officeDocument/2006/math" xmlns:mc="http://schemas.openxmlformats.org/markup-compatibility/2006" xmlns:mo="http://schemas.microsoft.com/office/mac/office/2008/main" xmlns:mv="urn:schemas-microsoft-com:mac:vml" xmlns:o="urn:schemas-microsoft-com:office:office" xmlns:r="http://schemas.openxmlformats.org/officeDocument/2006/relationships" xmlns:v="urn:schemas-microsoft-com:vml" xmlns:w10="urn:schemas-microsoft-com:office:word" xmlns:w14="http://schemas.microsoft.com/office/word/2010/wordml" xmlns:w="http://schemas.openxmlformats.org/wordprocessingml/2006/main" xmlns:wne="http://schemas.microsoft.com/office/word/2006/wordml" xmlns:wp14="http://schemas.microsoft.com/office/word/2010/wordprocessingDrawing" xmlns:wp="http://schemas.openxmlformats.org/drawingml/2006/wordprocessingDrawing" xmlns:wpc="http://schemas.microsoft.com/office/word/2010/wordprocessingCanvas" xmlns:wpg="http://schemas.microsoft.com/office/word/2010/wordprocessingGroup" xmlns:wpi="http://schemas.microsoft.com/office/word/2010/wordprocessingInk" xmlns:wps="http://schemas.microsoft.com/office/word/2010/wordprocessingShape" mc:Ignorable="w14 wp14">
-  <w:p>
-    <w:pPr>
-      <w:pStyle w:val="Footer"/>
-    </w:pPr>
-    <w:r/>
-    <w:r>
-      <w:rPr>
-        <w:rFonts w:ascii="Times New Roman" w:hAnsi="Times New Roman"/>
-        <w:color w:val="888888"/>
-        <w:sz w:val="16"/>
-      </w:rPr>
-      <w:t>Tugas klasifikasi_434241079</w:t>
-    </w:r>
-  </w:p>
-</w:ftr>
 </file>
 
 <file path=word/numbering.xml><?xml version="1.0" encoding="utf-8"?>

</xml_diff>